<commit_message>
Resume: L1 SOC Analyst @ Virtusa (MNC)
</commit_message>
<xml_diff>
--- a/resumes/Resume_L1_SOC_Analyst_Virtusa__MNC_.docx
+++ b/resumes/Resume_L1_SOC_Analyst_Virtusa__MNC_.docx
@@ -413,7 +413,7 @@
           <w:sz w:val="19"/>
           <w:szCs w:val="19"/>
         </w:rPr>
-        <w:t>Triaged 50+ weekly inventory reimbursement cases by severity and policy eligibility, adhering to Virtusa's SOC structured alert triage and escalation workflow.</w:t>
+        <w:t>Triaged 50+ weekly inventory reimbursement cases by severity and policy eligibility, following structured case triage and escalation workflows as an Analyst in Bangalore, India.</w:t>
       </w:r>
     </w:p>
     <w:p>
@@ -432,7 +432,7 @@
           <w:sz w:val="19"/>
           <w:szCs w:val="19"/>
         </w:rPr>
-        <w:t>Conducted root cause analysis on seller claims, identifying policy violations and anomalous patterns, and escalated findings to senior reviewers.</w:t>
+        <w:t>Investigated seller claims, identified policy violations and anomalous patterns, and escalated findings to senior reviewers in Virtusa SOC, Karnataka, India.</w:t>
       </w:r>
     </w:p>
     <w:p>
@@ -451,7 +451,7 @@
           <w:sz w:val="19"/>
           <w:szCs w:val="19"/>
         </w:rPr>
-        <w:t>Maintained audit-ready case documentation, recording investigation findings, decisions, and corrective actions, ensuring evidence chain-of-custody discipline.</w:t>
+        <w:t>Maintained audit-ready case documentation recording investigation findings, decisions, evidence notes, and corrective actions for L1 SOC Analyst role in Virtusa, Bangalore, India.</w:t>
       </w:r>
     </w:p>
     <w:p>
@@ -470,7 +470,7 @@
           <w:sz w:val="19"/>
           <w:szCs w:val="19"/>
         </w:rPr>
-        <w:t>Spotted recurring fraud patterns across 200+ weekly cases and flagged them early — cutting repeat-issue investigation time before escalation.</w:t>
+        <w:t>Spotted recurring fraud patterns across 200+ weekly cases and flagged them early, reducing repeat-issue investigation time before escalation as an Analyst in Virtusa SOC, India.</w:t>
       </w:r>
       <w:r>
         <w:rPr>
@@ -586,7 +586,7 @@
           <w:sz w:val="19"/>
           <w:szCs w:val="19"/>
         </w:rPr>
-        <w:t>Deployed Splunk SIEM with SPL searches for brute-force detection, lateral movement, and privilege escalation; mapped TTPs to MITRE ATT&amp;CK (T1110, T1078, T1059) and wrote incident report.</w:t>
+        <w:t>Deployed Splunk SIEM with SPL searches for brute-force detection, lateral movement, and privilege escalation (T1110, T1078, T1059); mapped TTPs and wrote incident report.</w:t>
       </w:r>
     </w:p>
     <w:p>
@@ -605,7 +605,7 @@
           <w:sz w:val="19"/>
           <w:szCs w:val="19"/>
         </w:rPr>
-        <w:t>Built automated SOAR-style detection pipeline: Python script ingests Splunk alerts, enriches with VirusTotal API, and dispatches Telegram notifications with severity classification.</w:t>
+        <w:t>Developed SOAR-style detection pipeline: Python script ingests Splunk alerts, enriches with VirusTotal API, and dispatches Telegram notifications with severity classification.</w:t>
       </w:r>
     </w:p>
     <w:p>
@@ -624,7 +624,7 @@
           <w:sz w:val="19"/>
           <w:szCs w:val="19"/>
         </w:rPr>
-        <w:t>Converted detection logic to Sigma rules (detection-as-code) for enterprise SOCs; analyzed TCP/IP traffic in Wireshark for SYN scans, DNS tunnelling, and plaintext credential exposure.</w:t>
+        <w:t>Converted Sigma rules from detection logic; analyzed TCP/IP traffic in Wireshark for SYN scans, DNS tunnelling, and plaintext credential exposure.</w:t>
       </w:r>
     </w:p>
     <w:p>
@@ -694,7 +694,7 @@
           <w:sz w:val="19"/>
           <w:szCs w:val="19"/>
         </w:rPr>
-        <w:t>Built multi-API threat intelligence pipeline: submits suspicious data to VirusTotal, AbuseIPDB, and URLScan.io; cross-references WHOIS, DNS, and SSL details for unified phishing score.</w:t>
+        <w:t>Built multi-API threat intelligence pipeline: submits suspicious data to VirusTotal, AbuseIPDB, and URLScan.io; cross-references WHOIS, DNS, and SSL details to produce a unified phishing probability score (EPSS 85).</w:t>
       </w:r>
     </w:p>
     <w:p>
@@ -868,7 +868,7 @@
           <w:sz w:val="19"/>
           <w:szCs w:val="19"/>
         </w:rPr>
-        <w:t>Python, Bash (basic), regular expressions, security, response</w:t>
+        <w:t>Python, Bash (basic), regular expressions, security</w:t>
       </w:r>
     </w:p>
     <w:p>

</xml_diff>